<commit_message>
Record unbiased chi128 branch-pilot progress: running: stage 1 accepted; next step remains separately gated
</commit_message>
<xml_diff>
--- a/research/transition-order/branch128-pilot-report.docx
+++ b/research/transition-order/branch128-pilot-report.docx
@@ -36,7 +36,7 @@
           <w:b w:val="0"/>
           <w:i w:val="0"/>
         </w:rPr>
-        <w:t xml:space="preserve"> running: authorized stage 1. The user separately authorized at most three hours overall, with at most two single-thread CPU workers. No χ192, extra crossing point or perturbation production is automatic.</w:t>
+        <w:t xml:space="preserve"> running: stage 1 accepted; next step remains separately gated. The user separately authorized at most three hours overall, with at most two single-thread CPU workers. No χ192, extra crossing point or perturbation production is automatic.</w:t>
       </w:r>
     </w:p>
     <w:p>
@@ -764,7 +764,7 @@
                 <w:i w:val="0"/>
                 <w:sz w:val="16"/>
               </w:rPr>
-              <w:t>—</w:t>
+              <w:t>1</w:t>
             </w:r>
           </w:p>
         </w:tc>
@@ -787,7 +787,7 @@
                 <w:i w:val="0"/>
                 <w:sz w:val="16"/>
               </w:rPr>
-              <w:t>—</w:t>
+              <w:t>ordered</w:t>
             </w:r>
           </w:p>
         </w:tc>
@@ -810,7 +810,7 @@
                 <w:i w:val="0"/>
                 <w:sz w:val="16"/>
               </w:rPr>
-              <w:t>—</w:t>
+              <w:t>0.30475</w:t>
             </w:r>
           </w:p>
         </w:tc>
@@ -833,7 +833,7 @@
                 <w:i w:val="0"/>
                 <w:sz w:val="16"/>
               </w:rPr>
-              <w:t>pending</w:t>
+              <w:t>accepted-finite-chi</w:t>
             </w:r>
           </w:p>
         </w:tc>
@@ -856,7 +856,7 @@
                 <w:i w:val="0"/>
                 <w:sz w:val="16"/>
               </w:rPr>
-              <w:t>—</w:t>
+              <w:t>8.194e-08</w:t>
             </w:r>
           </w:p>
         </w:tc>
@@ -879,7 +879,7 @@
                 <w:i w:val="0"/>
                 <w:sz w:val="16"/>
               </w:rPr>
-              <w:t>—</w:t>
+              <w:t>0.513220</w:t>
             </w:r>
           </w:p>
         </w:tc>
@@ -902,7 +902,7 @@
                 <w:i w:val="0"/>
                 <w:sz w:val="16"/>
               </w:rPr>
-              <w:t>—</w:t>
+              <w:t>0.99270791085</w:t>
             </w:r>
           </w:p>
         </w:tc>
@@ -925,7 +925,196 @@
                 <w:i w:val="0"/>
                 <w:sz w:val="16"/>
               </w:rPr>
-              <w:t>—</w:t>
+              <w:t>0.99270789853</w:t>
+            </w:r>
+          </w:p>
+        </w:tc>
+      </w:tr>
+      <w:tr>
+        <w:trPr>
+          <w:cantSplit/>
+        </w:trPr>
+        <w:tc>
+          <w:tcPr>
+            <w:tcW w:type="dxa" w:w="1218"/>
+          </w:tcPr>
+          <w:p>
+            <w:pPr>
+              <w:spacing w:after="40"/>
+            </w:pPr>
+            <w:r>
+              <w:rPr>
+                <w:sz w:val="16"/>
+              </w:rPr>
+            </w:r>
+            <w:r>
+              <w:rPr>
+                <w:b w:val="0"/>
+                <w:i w:val="0"/>
+                <w:sz w:val="16"/>
+              </w:rPr>
+              <w:t>1</w:t>
+            </w:r>
+          </w:p>
+        </w:tc>
+        <w:tc>
+          <w:tcPr>
+            <w:tcW w:type="dxa" w:w="1218"/>
+          </w:tcPr>
+          <w:p>
+            <w:pPr>
+              <w:spacing w:after="40"/>
+            </w:pPr>
+            <w:r>
+              <w:rPr>
+                <w:sz w:val="16"/>
+              </w:rPr>
+            </w:r>
+            <w:r>
+              <w:rPr>
+                <w:b w:val="0"/>
+                <w:i w:val="0"/>
+                <w:sz w:val="16"/>
+              </w:rPr>
+              <w:t>disordered</w:t>
+            </w:r>
+          </w:p>
+        </w:tc>
+        <w:tc>
+          <w:tcPr>
+            <w:tcW w:type="dxa" w:w="1218"/>
+          </w:tcPr>
+          <w:p>
+            <w:pPr>
+              <w:spacing w:after="40"/>
+            </w:pPr>
+            <w:r>
+              <w:rPr>
+                <w:sz w:val="16"/>
+              </w:rPr>
+            </w:r>
+            <w:r>
+              <w:rPr>
+                <w:b w:val="0"/>
+                <w:i w:val="0"/>
+                <w:sz w:val="16"/>
+              </w:rPr>
+              <w:t>0.30483</w:t>
+            </w:r>
+          </w:p>
+        </w:tc>
+        <w:tc>
+          <w:tcPr>
+            <w:tcW w:type="dxa" w:w="1218"/>
+          </w:tcPr>
+          <w:p>
+            <w:pPr>
+              <w:spacing w:after="40"/>
+            </w:pPr>
+            <w:r>
+              <w:rPr>
+                <w:sz w:val="16"/>
+              </w:rPr>
+            </w:r>
+            <w:r>
+              <w:rPr>
+                <w:b w:val="0"/>
+                <w:i w:val="0"/>
+                <w:sz w:val="16"/>
+              </w:rPr>
+              <w:t>accepted-finite-chi</w:t>
+            </w:r>
+          </w:p>
+        </w:tc>
+        <w:tc>
+          <w:tcPr>
+            <w:tcW w:type="dxa" w:w="1218"/>
+          </w:tcPr>
+          <w:p>
+            <w:pPr>
+              <w:spacing w:after="40"/>
+            </w:pPr>
+            <w:r>
+              <w:rPr>
+                <w:sz w:val="16"/>
+              </w:rPr>
+            </w:r>
+            <w:r>
+              <w:rPr>
+                <w:b w:val="0"/>
+                <w:i w:val="0"/>
+                <w:sz w:val="16"/>
+              </w:rPr>
+              <w:t>9.913e-08</w:t>
+            </w:r>
+          </w:p>
+        </w:tc>
+        <w:tc>
+          <w:tcPr>
+            <w:tcW w:type="dxa" w:w="1218"/>
+          </w:tcPr>
+          <w:p>
+            <w:pPr>
+              <w:spacing w:after="40"/>
+            </w:pPr>
+            <w:r>
+              <w:rPr>
+                <w:sz w:val="16"/>
+              </w:rPr>
+            </w:r>
+            <w:r>
+              <w:rPr>
+                <w:b w:val="0"/>
+                <w:i w:val="0"/>
+                <w:sz w:val="16"/>
+              </w:rPr>
+              <w:t>0.005362</w:t>
+            </w:r>
+          </w:p>
+        </w:tc>
+        <w:tc>
+          <w:tcPr>
+            <w:tcW w:type="dxa" w:w="1218"/>
+          </w:tcPr>
+          <w:p>
+            <w:pPr>
+              <w:spacing w:after="40"/>
+            </w:pPr>
+            <w:r>
+              <w:rPr>
+                <w:sz w:val="16"/>
+              </w:rPr>
+            </w:r>
+            <w:r>
+              <w:rPr>
+                <w:b w:val="0"/>
+                <w:i w:val="0"/>
+                <w:sz w:val="16"/>
+              </w:rPr>
+              <w:t>0.99296704401</w:t>
+            </w:r>
+          </w:p>
+        </w:tc>
+        <w:tc>
+          <w:tcPr>
+            <w:tcW w:type="dxa" w:w="1218"/>
+          </w:tcPr>
+          <w:p>
+            <w:pPr>
+              <w:spacing w:after="40"/>
+            </w:pPr>
+            <w:r>
+              <w:rPr>
+                <w:sz w:val="16"/>
+              </w:rPr>
+            </w:r>
+            <w:r>
+              <w:rPr>
+                <w:b w:val="0"/>
+                <w:i w:val="0"/>
+                <w:sz w:val="16"/>
+              </w:rPr>
+              <w:t>0.99296683247</w:t>
             </w:r>
           </w:p>
         </w:tc>

</xml_diff>

<commit_message>
Record unbiased chi128 branch-pilot progress: stopped: stage 2 acceptance gate not passed for both histories
</commit_message>
<xml_diff>
--- a/research/transition-order/branch128-pilot-report.docx
+++ b/research/transition-order/branch128-pilot-report.docx
@@ -36,7 +36,7 @@
           <w:b w:val="0"/>
           <w:i w:val="0"/>
         </w:rPr>
-        <w:t xml:space="preserve"> running: stage 1 accepted; next step remains separately gated. The user separately authorized at most three hours overall, with at most two single-thread CPU workers. No χ192, extra crossing point or perturbation production is automatic.</w:t>
+        <w:t xml:space="preserve"> stopped: stage 2 acceptance gate not passed for both histories. The user separately authorized at most three hours overall, with at most two single-thread CPU workers. No χ192, extra crossing point or perturbation production is automatic.</w:t>
       </w:r>
     </w:p>
     <w:p>
@@ -1119,6 +1119,384 @@
           </w:p>
         </w:tc>
       </w:tr>
+      <w:tr>
+        <w:trPr>
+          <w:cantSplit/>
+        </w:trPr>
+        <w:tc>
+          <w:tcPr>
+            <w:tcW w:type="dxa" w:w="1218"/>
+          </w:tcPr>
+          <w:p>
+            <w:pPr>
+              <w:spacing w:after="40"/>
+            </w:pPr>
+            <w:r>
+              <w:rPr>
+                <w:sz w:val="16"/>
+              </w:rPr>
+            </w:r>
+            <w:r>
+              <w:rPr>
+                <w:b w:val="0"/>
+                <w:i w:val="0"/>
+                <w:sz w:val="16"/>
+              </w:rPr>
+              <w:t>2</w:t>
+            </w:r>
+          </w:p>
+        </w:tc>
+        <w:tc>
+          <w:tcPr>
+            <w:tcW w:type="dxa" w:w="1218"/>
+          </w:tcPr>
+          <w:p>
+            <w:pPr>
+              <w:spacing w:after="40"/>
+            </w:pPr>
+            <w:r>
+              <w:rPr>
+                <w:sz w:val="16"/>
+              </w:rPr>
+            </w:r>
+            <w:r>
+              <w:rPr>
+                <w:b w:val="0"/>
+                <w:i w:val="0"/>
+                <w:sz w:val="16"/>
+              </w:rPr>
+              <w:t>ordered</w:t>
+            </w:r>
+          </w:p>
+        </w:tc>
+        <w:tc>
+          <w:tcPr>
+            <w:tcW w:type="dxa" w:w="1218"/>
+          </w:tcPr>
+          <w:p>
+            <w:pPr>
+              <w:spacing w:after="40"/>
+            </w:pPr>
+            <w:r>
+              <w:rPr>
+                <w:sz w:val="16"/>
+              </w:rPr>
+            </w:r>
+            <w:r>
+              <w:rPr>
+                <w:b w:val="0"/>
+                <w:i w:val="0"/>
+                <w:sz w:val="16"/>
+              </w:rPr>
+              <w:t>0.30480</w:t>
+            </w:r>
+          </w:p>
+        </w:tc>
+        <w:tc>
+          <w:tcPr>
+            <w:tcW w:type="dxa" w:w="1218"/>
+          </w:tcPr>
+          <w:p>
+            <w:pPr>
+              <w:spacing w:after="40"/>
+            </w:pPr>
+            <w:r>
+              <w:rPr>
+                <w:sz w:val="16"/>
+              </w:rPr>
+            </w:r>
+            <w:r>
+              <w:rPr>
+                <w:b w:val="0"/>
+                <w:i w:val="0"/>
+                <w:sz w:val="16"/>
+              </w:rPr>
+              <w:t>accepted-finite-chi</w:t>
+            </w:r>
+          </w:p>
+        </w:tc>
+        <w:tc>
+          <w:tcPr>
+            <w:tcW w:type="dxa" w:w="1218"/>
+          </w:tcPr>
+          <w:p>
+            <w:pPr>
+              <w:spacing w:after="40"/>
+            </w:pPr>
+            <w:r>
+              <w:rPr>
+                <w:sz w:val="16"/>
+              </w:rPr>
+            </w:r>
+            <w:r>
+              <w:rPr>
+                <w:b w:val="0"/>
+                <w:i w:val="0"/>
+                <w:sz w:val="16"/>
+              </w:rPr>
+              <w:t>9.065e-08</w:t>
+            </w:r>
+          </w:p>
+        </w:tc>
+        <w:tc>
+          <w:tcPr>
+            <w:tcW w:type="dxa" w:w="1218"/>
+          </w:tcPr>
+          <w:p>
+            <w:pPr>
+              <w:spacing w:after="40"/>
+            </w:pPr>
+            <w:r>
+              <w:rPr>
+                <w:sz w:val="16"/>
+              </w:rPr>
+            </w:r>
+            <w:r>
+              <w:rPr>
+                <w:b w:val="0"/>
+                <w:i w:val="0"/>
+                <w:sz w:val="16"/>
+              </w:rPr>
+              <w:t>0.488232</w:t>
+            </w:r>
+          </w:p>
+        </w:tc>
+        <w:tc>
+          <w:tcPr>
+            <w:tcW w:type="dxa" w:w="1218"/>
+          </w:tcPr>
+          <w:p>
+            <w:pPr>
+              <w:spacing w:after="40"/>
+            </w:pPr>
+            <w:r>
+              <w:rPr>
+                <w:sz w:val="16"/>
+              </w:rPr>
+            </w:r>
+            <w:r>
+              <w:rPr>
+                <w:b w:val="0"/>
+                <w:i w:val="0"/>
+                <w:sz w:val="16"/>
+              </w:rPr>
+              <w:t>0.99286988547</w:t>
+            </w:r>
+          </w:p>
+        </w:tc>
+        <w:tc>
+          <w:tcPr>
+            <w:tcW w:type="dxa" w:w="1218"/>
+          </w:tcPr>
+          <w:p>
+            <w:pPr>
+              <w:spacing w:after="40"/>
+            </w:pPr>
+            <w:r>
+              <w:rPr>
+                <w:sz w:val="16"/>
+              </w:rPr>
+            </w:r>
+            <w:r>
+              <w:rPr>
+                <w:b w:val="0"/>
+                <w:i w:val="0"/>
+                <w:sz w:val="16"/>
+              </w:rPr>
+              <w:t>0.99286986444</w:t>
+            </w:r>
+          </w:p>
+        </w:tc>
+      </w:tr>
+      <w:tr>
+        <w:trPr>
+          <w:cantSplit/>
+        </w:trPr>
+        <w:tc>
+          <w:tcPr>
+            <w:tcW w:type="dxa" w:w="1218"/>
+          </w:tcPr>
+          <w:p>
+            <w:pPr>
+              <w:spacing w:after="40"/>
+            </w:pPr>
+            <w:r>
+              <w:rPr>
+                <w:sz w:val="16"/>
+              </w:rPr>
+            </w:r>
+            <w:r>
+              <w:rPr>
+                <w:b w:val="0"/>
+                <w:i w:val="0"/>
+                <w:sz w:val="16"/>
+              </w:rPr>
+              <w:t>2</w:t>
+            </w:r>
+          </w:p>
+        </w:tc>
+        <w:tc>
+          <w:tcPr>
+            <w:tcW w:type="dxa" w:w="1218"/>
+          </w:tcPr>
+          <w:p>
+            <w:pPr>
+              <w:spacing w:after="40"/>
+            </w:pPr>
+            <w:r>
+              <w:rPr>
+                <w:sz w:val="16"/>
+              </w:rPr>
+            </w:r>
+            <w:r>
+              <w:rPr>
+                <w:b w:val="0"/>
+                <w:i w:val="0"/>
+                <w:sz w:val="16"/>
+              </w:rPr>
+              <w:t>disordered</w:t>
+            </w:r>
+          </w:p>
+        </w:tc>
+        <w:tc>
+          <w:tcPr>
+            <w:tcW w:type="dxa" w:w="1218"/>
+          </w:tcPr>
+          <w:p>
+            <w:pPr>
+              <w:spacing w:after="40"/>
+            </w:pPr>
+            <w:r>
+              <w:rPr>
+                <w:sz w:val="16"/>
+              </w:rPr>
+            </w:r>
+            <w:r>
+              <w:rPr>
+                <w:b w:val="0"/>
+                <w:i w:val="0"/>
+                <w:sz w:val="16"/>
+              </w:rPr>
+              <w:t>0.30480</w:t>
+            </w:r>
+          </w:p>
+        </w:tc>
+        <w:tc>
+          <w:tcPr>
+            <w:tcW w:type="dxa" w:w="1218"/>
+          </w:tcPr>
+          <w:p>
+            <w:pPr>
+              <w:spacing w:after="40"/>
+            </w:pPr>
+            <w:r>
+              <w:rPr>
+                <w:sz w:val="16"/>
+              </w:rPr>
+            </w:r>
+            <w:r>
+              <w:rPr>
+                <w:b w:val="0"/>
+                <w:i w:val="0"/>
+                <w:sz w:val="16"/>
+              </w:rPr>
+              <w:t>iteration-cap-or-stationarity-check-failed</w:t>
+            </w:r>
+          </w:p>
+        </w:tc>
+        <w:tc>
+          <w:tcPr>
+            <w:tcW w:type="dxa" w:w="1218"/>
+          </w:tcPr>
+          <w:p>
+            <w:pPr>
+              <w:spacing w:after="40"/>
+            </w:pPr>
+            <w:r>
+              <w:rPr>
+                <w:sz w:val="16"/>
+              </w:rPr>
+            </w:r>
+            <w:r>
+              <w:rPr>
+                <w:b w:val="0"/>
+                <w:i w:val="0"/>
+                <w:sz w:val="16"/>
+              </w:rPr>
+              <w:t>9.996e-08</w:t>
+            </w:r>
+          </w:p>
+        </w:tc>
+        <w:tc>
+          <w:tcPr>
+            <w:tcW w:type="dxa" w:w="1218"/>
+          </w:tcPr>
+          <w:p>
+            <w:pPr>
+              <w:spacing w:after="40"/>
+            </w:pPr>
+            <w:r>
+              <w:rPr>
+                <w:sz w:val="16"/>
+              </w:rPr>
+            </w:r>
+            <w:r>
+              <w:rPr>
+                <w:b w:val="0"/>
+                <w:i w:val="0"/>
+                <w:sz w:val="16"/>
+              </w:rPr>
+              <w:t>—</w:t>
+            </w:r>
+          </w:p>
+        </w:tc>
+        <w:tc>
+          <w:tcPr>
+            <w:tcW w:type="dxa" w:w="1218"/>
+          </w:tcPr>
+          <w:p>
+            <w:pPr>
+              <w:spacing w:after="40"/>
+            </w:pPr>
+            <w:r>
+              <w:rPr>
+                <w:sz w:val="16"/>
+              </w:rPr>
+            </w:r>
+            <w:r>
+              <w:rPr>
+                <w:b w:val="0"/>
+                <w:i w:val="0"/>
+                <w:sz w:val="16"/>
+              </w:rPr>
+              <w:t>—</w:t>
+            </w:r>
+          </w:p>
+        </w:tc>
+        <w:tc>
+          <w:tcPr>
+            <w:tcW w:type="dxa" w:w="1218"/>
+          </w:tcPr>
+          <w:p>
+            <w:pPr>
+              <w:spacing w:after="40"/>
+            </w:pPr>
+            <w:r>
+              <w:rPr>
+                <w:sz w:val="16"/>
+              </w:rPr>
+            </w:r>
+            <w:r>
+              <w:rPr>
+                <w:b w:val="0"/>
+                <w:i w:val="0"/>
+                <w:sz w:val="16"/>
+              </w:rPr>
+              <w:t>—</w:t>
+            </w:r>
+          </w:p>
+        </w:tc>
+      </w:tr>
     </w:tbl>
     <w:p>
       <w:pPr>

</xml_diff>